<commit_message>
insatando prisma e gerando migrate, criando estrutura terraform e docker
</commit_message>
<xml_diff>
--- a/resources/definicoes-sistema.docx
+++ b/resources/definicoes-sistema.docx
@@ -31,77 +31,367 @@
           </w:tcPr>
           <w:p>
             <w:r>
-              <w:t>/login</w:t>
+              <w:t xml:space="preserve">/login </w:t>
+            </w:r>
+          </w:p>
+        </w:tc>
+      </w:tr>
+      <w:tr>
+        <w:tc>
+          <w:tcPr>
+            <w:tcW w:w="10762" w:type="dxa"/>
+          </w:tcPr>
+          <w:p>
+            <w:r>
+              <w:t xml:space="preserve">/agendar </w:t>
+            </w:r>
+          </w:p>
+        </w:tc>
+      </w:tr>
+      <w:tr>
+        <w:tc>
+          <w:tcPr>
+            <w:tcW w:w="10762" w:type="dxa"/>
+          </w:tcPr>
+          <w:p>
+            <w:r>
+              <w:t>/consultaragenda</w:t>
+            </w:r>
+          </w:p>
+        </w:tc>
+      </w:tr>
+      <w:tr>
+        <w:tc>
+          <w:tcPr>
+            <w:tcW w:w="10762" w:type="dxa"/>
+          </w:tcPr>
+          <w:p>
+            <w:r>
+              <w:t>/listaragenda</w:t>
+            </w:r>
+          </w:p>
+        </w:tc>
+      </w:tr>
+      <w:tr>
+        <w:tc>
+          <w:tcPr>
+            <w:tcW w:w="10762" w:type="dxa"/>
+          </w:tcPr>
+          <w:p>
+            <w:r>
+              <w:t>/alteraragenda</w:t>
+            </w:r>
+          </w:p>
+        </w:tc>
+      </w:tr>
+      <w:tr>
+        <w:tc>
+          <w:tcPr>
+            <w:tcW w:w="10762" w:type="dxa"/>
+          </w:tcPr>
+          <w:p/>
+        </w:tc>
+      </w:tr>
+    </w:tbl>
+    <w:p/>
+    <w:tbl>
+      <w:tblPr>
+        <w:tblStyle w:val="Tabelacomgrade"/>
+        <w:tblW w:w="0" w:type="auto"/>
+        <w:tblLook w:val="04A0" w:firstRow="1" w:lastRow="0" w:firstColumn="1" w:lastColumn="0" w:noHBand="0" w:noVBand="1"/>
+      </w:tblPr>
+      <w:tblGrid>
+        <w:gridCol w:w="10762"/>
+      </w:tblGrid>
+      <w:tr>
+        <w:tc>
+          <w:tcPr>
+            <w:tcW w:w="10762" w:type="dxa"/>
+          </w:tcPr>
+          <w:p>
+            <w:r>
+              <w:t>Esquema do banco de dados</w:t>
+            </w:r>
+          </w:p>
+        </w:tc>
+      </w:tr>
+      <w:tr>
+        <w:tc>
+          <w:tcPr>
+            <w:tcW w:w="10762" w:type="dxa"/>
+          </w:tcPr>
+          <w:p>
+            <w:r>
+              <w:t>Tabelas</w:t>
+            </w:r>
+          </w:p>
+          <w:p>
+            <w:r>
+              <w:t>AGENDA</w:t>
+            </w:r>
+            <w:r>
+              <w:t>MENTOS</w:t>
+            </w:r>
+          </w:p>
+          <w:p>
+            <w:r>
+              <w:t>CLIENTES</w:t>
+            </w:r>
+          </w:p>
+          <w:p>
+            <w:r>
+              <w:t>VEICULOS</w:t>
+            </w:r>
+          </w:p>
+          <w:p>
+            <w:r>
+              <w:t>SERVICOS</w:t>
+            </w:r>
+          </w:p>
+          <w:p>
+            <w:r>
+              <w:t>AGENDA</w:t>
+            </w:r>
+          </w:p>
+        </w:tc>
+      </w:tr>
+      <w:tr>
+        <w:tc>
+          <w:tcPr>
+            <w:tcW w:w="10762" w:type="dxa"/>
+          </w:tcPr>
+          <w:p>
+            <w:r>
+              <w:t>AGENDA</w:t>
+            </w:r>
+            <w:r>
+              <w:t>MENTOS</w:t>
+            </w:r>
+          </w:p>
+          <w:p>
+            <w:r>
+              <w:tab/>
+              <w:t>ID_AGENDAMENTO</w:t>
+            </w:r>
+          </w:p>
+          <w:p>
+            <w:r>
+              <w:tab/>
+              <w:t>DESCRICAO</w:t>
+            </w:r>
+          </w:p>
+          <w:p>
+            <w:r>
+              <w:tab/>
+              <w:t>DATA_AGENDAMENTO</w:t>
+            </w:r>
+            <w:r>
+              <w:t xml:space="preserve"> TIMESTAMP</w:t>
+            </w:r>
+          </w:p>
+          <w:p>
+            <w:r>
+              <w:tab/>
+              <w:t>ID_VEICULO</w:t>
+            </w:r>
+          </w:p>
+          <w:p>
+            <w:r>
+              <w:tab/>
+            </w:r>
+            <w:r>
+              <w:t>ID_CLIENTE</w:t>
+            </w:r>
+          </w:p>
+          <w:p>
+            <w:r>
+              <w:tab/>
+              <w:t>ID_SERVICO</w:t>
+            </w:r>
+          </w:p>
+          <w:p>
+            <w:r>
+              <w:tab/>
+              <w:t>DATA_CANCELAMENTO</w:t>
+            </w:r>
+          </w:p>
+          <w:p>
+            <w:r>
+              <w:tab/>
+              <w:t>DATA_SERVICO</w:t>
+            </w:r>
+          </w:p>
+        </w:tc>
+      </w:tr>
+      <w:tr>
+        <w:tc>
+          <w:tcPr>
+            <w:tcW w:w="10762" w:type="dxa"/>
+          </w:tcPr>
+          <w:p>
+            <w:r>
+              <w:t>CLIENTES</w:t>
+            </w:r>
+          </w:p>
+          <w:p>
+            <w:r>
+              <w:tab/>
+              <w:t>ID_CLIENTE</w:t>
+            </w:r>
+          </w:p>
+          <w:p>
+            <w:r>
+              <w:tab/>
+              <w:t>NOME</w:t>
+            </w:r>
+          </w:p>
+          <w:p>
+            <w:r>
+              <w:tab/>
+              <w:t>TELEFONE</w:t>
+            </w:r>
+          </w:p>
+          <w:p>
+            <w:r>
+              <w:tab/>
+              <w:t>EMAIL</w:t>
+            </w:r>
+          </w:p>
+        </w:tc>
+      </w:tr>
+      <w:tr>
+        <w:tc>
+          <w:tcPr>
+            <w:tcW w:w="10762" w:type="dxa"/>
+          </w:tcPr>
+          <w:p>
+            <w:r>
+              <w:t>VEICULOS</w:t>
+            </w:r>
+          </w:p>
+          <w:p>
+            <w:r>
+              <w:tab/>
+            </w:r>
+            <w:r>
+              <w:t>ID_VEICULO</w:t>
             </w:r>
             <w:r>
               <w:t xml:space="preserve"> </w:t>
             </w:r>
           </w:p>
-        </w:tc>
-      </w:tr>
-      <w:tr>
-        <w:tc>
-          <w:tcPr>
-            <w:tcW w:w="10762" w:type="dxa"/>
-          </w:tcPr>
-          <w:p>
-            <w:r>
-              <w:t>/agendar</w:t>
-            </w:r>
-            <w:r>
-              <w:t xml:space="preserve"> </w:t>
-            </w:r>
-          </w:p>
-        </w:tc>
-      </w:tr>
-      <w:tr>
-        <w:tc>
-          <w:tcPr>
-            <w:tcW w:w="10762" w:type="dxa"/>
-          </w:tcPr>
-          <w:p>
-            <w:r>
-              <w:t>/</w:t>
-            </w:r>
-            <w:proofErr w:type="spellStart"/>
-            <w:r>
-              <w:t>consultaragenda</w:t>
-            </w:r>
-            <w:proofErr w:type="spellEnd"/>
-          </w:p>
-        </w:tc>
-      </w:tr>
-      <w:tr>
-        <w:tc>
-          <w:tcPr>
-            <w:tcW w:w="10762" w:type="dxa"/>
-          </w:tcPr>
-          <w:p>
-            <w:r>
-              <w:t>/</w:t>
-            </w:r>
-            <w:proofErr w:type="spellStart"/>
-            <w:r>
-              <w:t>listaragenda</w:t>
-            </w:r>
-            <w:proofErr w:type="spellEnd"/>
-          </w:p>
-        </w:tc>
-      </w:tr>
-      <w:tr>
-        <w:tc>
-          <w:tcPr>
-            <w:tcW w:w="10762" w:type="dxa"/>
-          </w:tcPr>
-          <w:p>
-            <w:r>
-              <w:t>/</w:t>
-            </w:r>
-            <w:proofErr w:type="spellStart"/>
-            <w:r>
-              <w:t>alteraragenda</w:t>
-            </w:r>
-            <w:proofErr w:type="spellEnd"/>
+          <w:p>
+            <w:r>
+              <w:tab/>
+              <w:t>ID_CLIENTE</w:t>
+            </w:r>
+          </w:p>
+          <w:p>
+            <w:r>
+              <w:tab/>
+              <w:t>MARCA</w:t>
+            </w:r>
+          </w:p>
+          <w:p>
+            <w:r>
+              <w:tab/>
+              <w:t>MODELO</w:t>
+            </w:r>
+          </w:p>
+          <w:p>
+            <w:r>
+              <w:tab/>
+              <w:t>PLACA</w:t>
+            </w:r>
+          </w:p>
+          <w:p>
+            <w:r>
+              <w:tab/>
+              <w:t>ANO</w:t>
+            </w:r>
+          </w:p>
+        </w:tc>
+      </w:tr>
+      <w:tr>
+        <w:tc>
+          <w:tcPr>
+            <w:tcW w:w="10762" w:type="dxa"/>
+          </w:tcPr>
+          <w:p>
+            <w:r>
+              <w:t>SERVICOS</w:t>
+            </w:r>
+          </w:p>
+          <w:p>
+            <w:r>
+              <w:tab/>
+              <w:t>ID_SERVICO</w:t>
+            </w:r>
+          </w:p>
+          <w:p>
+            <w:pPr>
+              <w:rPr>
+                <w:u w:val="single"/>
+              </w:rPr>
+            </w:pPr>
+            <w:r>
+              <w:tab/>
+              <w:t>DESCRICAO</w:t>
+            </w:r>
+          </w:p>
+          <w:p>
+            <w:r>
+              <w:tab/>
+              <w:t>VALOR</w:t>
+            </w:r>
+          </w:p>
+          <w:p>
+            <w:r>
+              <w:tab/>
+              <w:t>ATIVO</w:t>
+            </w:r>
+          </w:p>
+        </w:tc>
+      </w:tr>
+      <w:tr>
+        <w:tc>
+          <w:tcPr>
+            <w:tcW w:w="10762" w:type="dxa"/>
+          </w:tcPr>
+          <w:p>
+            <w:r>
+              <w:t>AGENDA</w:t>
+            </w:r>
+          </w:p>
+          <w:p>
+            <w:r>
+              <w:tab/>
+              <w:t>ID_AGENDA</w:t>
+            </w:r>
+          </w:p>
+          <w:p>
+            <w:r>
+              <w:tab/>
+              <w:t>ID_SERVICO</w:t>
+            </w:r>
+          </w:p>
+          <w:p>
+            <w:r>
+              <w:tab/>
+              <w:t>DIA</w:t>
+            </w:r>
+          </w:p>
+          <w:p>
+            <w:r>
+              <w:tab/>
+              <w:t>HORARIO</w:t>
+            </w:r>
+          </w:p>
+          <w:p>
+            <w:r>
+              <w:tab/>
+              <w:t>QTD_VAGAS</w:t>
+            </w:r>
           </w:p>
         </w:tc>
       </w:tr>

</xml_diff>